<commit_message>
Add SPECIFICATION.md (PRD); switch intent to manual input (remove OCR)
</commit_message>
<xml_diff>
--- a/package-returns-traceability.docx
+++ b/package-returns-traceability.docx
@@ -756,16 +756,50 @@
           <w:sz w:val="28"/>
           <w:sz-cs w:val="28"/>
         </w:rPr>
-        <w:t xml:space="preserve">. The user records that value with the </w:t>
-      </w:r>
-      <w:r>
-        <w:rPr>
-          <w:rFonts w:ascii="Arial" w:hAnsi="Arial" w:cs="Arial"/>
-          <w:sz w:val="28"/>
-          <w:sz-cs w:val="28"/>
-          <w:b/>
-        </w:rPr>
-        <w:t xml:space="preserve">return reason</w:t>
+        <w:t xml:space="preserve">. The user </w:t>
+      </w:r>
+      <w:r>
+        <w:rPr>
+          <w:rFonts w:ascii="Arial" w:hAnsi="Arial" w:cs="Arial"/>
+          <w:sz w:val="28"/>
+          <w:sz-cs w:val="28"/>
+          <w:b/>
+        </w:rPr>
+        <w:t xml:space="preserve">manually types the sender ID</w:t>
+      </w:r>
+      <w:r>
+        <w:rPr>
+          <w:rFonts w:ascii="Arial" w:hAnsi="Arial" w:cs="Arial"/>
+          <w:sz w:val="28"/>
+          <w:sz-cs w:val="28"/>
+        </w:rPr>
+        <w:t xml:space="preserve"> (no OCR, no photos), the app </w:t>
+      </w:r>
+      <w:r>
+        <w:rPr>
+          <w:rFonts w:ascii="Arial" w:hAnsi="Arial" w:cs="Arial"/>
+          <w:sz w:val="28"/>
+          <w:sz-cs w:val="28"/>
+          <w:b/>
+        </w:rPr>
+        <w:t xml:space="preserve">validates it against the campaign</w:t>
+      </w:r>
+      <w:r>
+        <w:rPr>
+          <w:rFonts w:ascii="Arial" w:hAnsi="Arial" w:cs="Arial"/>
+          <w:sz w:val="28"/>
+          <w:sz-cs w:val="28"/>
+        </w:rPr>
+        <w:t xml:space="preserve">, and then </w:t>
+      </w:r>
+      <w:r>
+        <w:rPr>
+          <w:rFonts w:ascii="Arial" w:hAnsi="Arial" w:cs="Arial"/>
+          <w:sz w:val="28"/>
+          <w:sz-cs w:val="28"/>
+          <w:b/>
+        </w:rPr>
+        <w:t xml:space="preserve">asks for the return reason</w:t>
       </w:r>
       <w:r>
         <w:rPr>
@@ -790,162 +824,7 @@
           <w:sz w:val="28"/>
           <w:sz-cs w:val="28"/>
         </w:rPr>
-        <w:t xml:space="preserve">.</w:t>
-      </w:r>
-    </w:p>
-    <w:p>
-      <w:pPr>
-        <w:spacing w:after="120"/>
-      </w:pPr>
-      <w:r>
-        <w:rPr>
-          <w:rFonts w:ascii="Arial" w:hAnsi="Arial" w:cs="Arial"/>
-          <w:sz w:val="28"/>
-          <w:sz-cs w:val="28"/>
-        </w:rPr>
-        <w:t xml:space="preserve">On </w:t>
-      </w:r>
-      <w:r>
-        <w:rPr>
-          <w:rFonts w:ascii="Arial" w:hAnsi="Arial" w:cs="Arial"/>
-          <w:sz w:val="28"/>
-          <w:sz-cs w:val="28"/>
-          <w:b/>
-        </w:rPr>
-        <w:t xml:space="preserve">campaign setup</w:t>
-      </w:r>
-      <w:r>
-        <w:rPr>
-          <w:rFonts w:ascii="Arial" w:hAnsi="Arial" w:cs="Arial"/>
-          <w:sz w:val="28"/>
-          <w:sz-cs w:val="28"/>
-        </w:rPr>
-        <w:t xml:space="preserve">, a form field defines the </w:t>
-      </w:r>
-      <w:r>
-        <w:rPr>
-          <w:rFonts w:ascii="Arial" w:hAnsi="Arial" w:cs="Arial"/>
-          <w:sz w:val="28"/>
-          <w:sz-cs w:val="28"/>
-          <w:b/>
-        </w:rPr>
-        <w:t xml:space="preserve">Name</w:t>
-      </w:r>
-      <w:r>
-        <w:rPr>
-          <w:rFonts w:ascii="Arial" w:hAnsi="Arial" w:cs="Arial"/>
-          <w:sz w:val="28"/>
-          <w:sz-cs w:val="28"/>
-          <w:b/>
-          <w:i/>
-        </w:rPr>
-        <w:t xml:space="preserve">Code</w:t>
-      </w:r>
-      <w:r>
-        <w:rPr>
-          <w:rFonts w:ascii="Arial" w:hAnsi="Arial" w:cs="Arial"/>
-          <w:sz w:val="28"/>
-          <w:sz-cs w:val="28"/>
-          <w:i/>
-        </w:rPr>
-        <w:t xml:space="preserve"> for each sender ID; the OCR uses that to read the photos. Returns are </w:t>
-      </w:r>
-      <w:r>
-        <w:rPr>
-          <w:rFonts w:ascii="Arial" w:hAnsi="Arial" w:cs="Arial"/>
-          <w:sz w:val="28"/>
-          <w:sz-cs w:val="28"/>
-          <w:b/>
-          <w:i/>
-        </w:rPr>
-        <w:t xml:space="preserve">photographed</w:t>
-      </w:r>
-      <w:r>
-        <w:rPr>
-          <w:rFonts w:ascii="Arial" w:hAnsi="Arial" w:cs="Arial"/>
-          <w:sz w:val="28"/>
-          <w:sz-cs w:val="28"/>
-          <w:i/>
-        </w:rPr>
-        <w:t xml:space="preserve">, and the OCR reads the </w:t>
-      </w:r>
-      <w:r>
-        <w:rPr>
-          <w:rFonts w:ascii="Arial" w:hAnsi="Arial" w:cs="Arial"/>
-          <w:sz w:val="28"/>
-          <w:sz-cs w:val="28"/>
-          <w:b/>
-          <w:i/>
-        </w:rPr>
-        <w:t xml:space="preserve">Name</w:t>
-      </w:r>
-      <w:r>
-        <w:rPr>
-          <w:rFonts w:ascii="Arial" w:hAnsi="Arial" w:cs="Arial"/>
-          <w:sz w:val="28"/>
-          <w:sz-cs w:val="28"/>
-          <w:b/>
-        </w:rPr>
-        <w:t xml:space="preserve">Code and the Sender ID</w:t>
-      </w:r>
-      <w:r>
-        <w:rPr>
-          <w:rFonts w:ascii="Arial" w:hAnsi="Arial" w:cs="Arial"/>
-          <w:sz w:val="28"/>
-          <w:sz-cs w:val="28"/>
-        </w:rPr>
-        <w:t xml:space="preserve">. The Sender ID is </w:t>
-      </w:r>
-      <w:r>
-        <w:rPr>
-          <w:rFonts w:ascii="Arial" w:hAnsi="Arial" w:cs="Arial"/>
-          <w:sz w:val="28"/>
-          <w:sz-cs w:val="28"/>
-          <w:b/>
-        </w:rPr>
-        <w:t xml:space="preserve">auto-read into the database and validated</w:t>
-      </w:r>
-      <w:r>
-        <w:rPr>
-          <w:rFonts w:ascii="Arial" w:hAnsi="Arial" w:cs="Arial"/>
-          <w:sz w:val="28"/>
-          <w:sz-cs w:val="28"/>
-        </w:rPr>
-        <w:t xml:space="preserve">, and the app then </w:t>
-      </w:r>
-      <w:r>
-        <w:rPr>
-          <w:rFonts w:ascii="Arial" w:hAnsi="Arial" w:cs="Arial"/>
-          <w:sz w:val="28"/>
-          <w:sz-cs w:val="28"/>
-          <w:b/>
-        </w:rPr>
-        <w:t xml:space="preserve">asks for the return reason</w:t>
-      </w:r>
-      <w:r>
-        <w:rPr>
-          <w:rFonts w:ascii="Arial" w:hAnsi="Arial" w:cs="Arial"/>
-          <w:sz w:val="28"/>
-          <w:sz-cs w:val="28"/>
-        </w:rPr>
-        <w:t xml:space="preserve">. Photos must use </w:t>
-      </w:r>
-      <w:r>
-        <w:rPr>
-          <w:rFonts w:ascii="Arial" w:hAnsi="Arial" w:cs="Arial"/>
-          <w:sz w:val="28"/>
-          <w:sz-cs w:val="28"/>
-          <w:b/>
-        </w:rPr>
-        <w:t xml:space="preserve">minimal disk space</w:t>
-      </w:r>
-      <w:r>
-        <w:rPr>
-          <w:rFonts w:ascii="Arial" w:hAnsi="Arial" w:cs="Arial"/>
-          <w:sz w:val="28"/>
-          <w:sz-cs w:val="28"/>
-        </w:rPr>
-        <w:t xml:space="preserve">, and at the end of each campaign the files can be deleted. </w:t>
+        <w:t xml:space="preserve">. </w:t>
       </w:r>
       <w:r>
         <w:rPr>
@@ -962,24 +841,7 @@
           <w:sz w:val="28"/>
           <w:sz-cs w:val="28"/>
         </w:rPr>
-        <w:t xml:space="preserve"> Using a phone camera + OCR is </w:t>
-      </w:r>
-      <w:r>
-        <w:rPr>
-          <w:rFonts w:ascii="Arial" w:hAnsi="Arial" w:cs="Arial"/>
-          <w:sz w:val="28"/>
-          <w:sz-cs w:val="28"/>
-          <w:b/>
-        </w:rPr>
-        <w:t xml:space="preserve">optional</w:t>
-      </w:r>
-      <w:r>
-        <w:rPr>
-          <w:rFonts w:ascii="Arial" w:hAnsi="Arial" w:cs="Arial"/>
-          <w:sz w:val="28"/>
-          <w:sz-cs w:val="28"/>
-        </w:rPr>
-        <w:t xml:space="preserve"> (a trade-off of time/disk versus manual entry).</w:t>
+        <w:t xml:space="preserve"/>
       </w:r>
     </w:p>
     <w:p>
@@ -1096,90 +958,7 @@
           <w:sz w:val="28"/>
           <w:sz-cs w:val="28"/>
         </w:rPr>
-        <w:t xml:space="preserve"> </w:t>
-      </w:r>
-      <w:r>
-        <w:rPr>
-          <w:rFonts w:ascii="Arial" w:hAnsi="Arial" w:cs="Arial"/>
-          <w:sz w:val="28"/>
-          <w:sz-cs w:val="28"/>
-          <w:b/>
-        </w:rPr>
-        <w:t xml:space="preserve">Google ML Kit Text Recognition</w:t>
-      </w:r>
-      <w:r>
-        <w:rPr>
-          <w:rFonts w:ascii="Arial" w:hAnsi="Arial" w:cs="Arial"/>
-          <w:sz w:val="28"/>
-          <w:sz-cs w:val="28"/>
-        </w:rPr>
-        <w:t xml:space="preserve"> — on-device, free.</w:t>
-      </w:r>
-    </w:p>
-    <w:p>
-      <w:pPr>
-        <w:ind w:left="720" w:first-line="-360"/>
-        <w:spacing w:after="120"/>
-      </w:pPr>
-      <w:r>
-        <w:rPr>
-          <w:rFonts w:ascii="Arial" w:hAnsi="Arial" w:cs="Arial"/>
-          <w:sz w:val="28"/>
-          <w:sz-cs w:val="28"/>
-        </w:rPr>
-        <w:t xml:space="preserve">•</w:t>
-        <w:tab/>
-        <w:t xml:space="preserve"/>
-      </w:r>
-      <w:r>
-        <w:rPr>
-          <w:rFonts w:ascii="Arial" w:hAnsi="Arial" w:cs="Arial"/>
-          <w:sz w:val="28"/>
-          <w:sz-cs w:val="28"/>
-          <w:b/>
-        </w:rPr>
-        <w:t xml:space="preserve">Barcode/QR:</w:t>
-      </w:r>
-      <w:r>
-        <w:rPr>
-          <w:rFonts w:ascii="Arial" w:hAnsi="Arial" w:cs="Arial"/>
-          <w:sz w:val="28"/>
-          <w:sz-cs w:val="28"/>
-        </w:rPr>
-        <w:t xml:space="preserve"> not possible.</w:t>
-      </w:r>
-    </w:p>
-    <w:p>
-      <w:pPr>
-        <w:ind w:left="720" w:first-line="-360"/>
-        <w:spacing w:after="120"/>
-      </w:pPr>
-      <w:r>
-        <w:rPr>
-          <w:rFonts w:ascii="Arial" w:hAnsi="Arial" w:cs="Arial"/>
-          <w:sz w:val="28"/>
-          <w:sz-cs w:val="28"/>
-        </w:rPr>
-        <w:t xml:space="preserve">•</w:t>
-        <w:tab/>
-        <w:t xml:space="preserve"/>
-      </w:r>
-      <w:r>
-        <w:rPr>
-          <w:rFonts w:ascii="Arial" w:hAnsi="Arial" w:cs="Arial"/>
-          <w:sz w:val="28"/>
-          <w:sz-cs w:val="28"/>
-          <w:b/>
-        </w:rPr>
-        <w:t xml:space="preserve">Bad/partial photo → manual entry.</w:t>
-      </w:r>
-      <w:r>
-        <w:rPr>
-          <w:rFonts w:ascii="Arial" w:hAnsi="Arial" w:cs="Arial"/>
-          <w:sz w:val="28"/>
-          <w:sz-cs w:val="28"/>
-        </w:rPr>
-        <w:t xml:space="preserve"/>
+        <w:t xml:space="preserve"> removed from v1 (manual entry). Optional OCR / barcode scanning is deferred to v2.</w:t>
       </w:r>
     </w:p>
     <w:p>

</xml_diff>

<commit_message>
Fix md2rtf for ESM; regenerate Word doc without Supabase
</commit_message>
<xml_diff>
--- a/package-returns-traceability.docx
+++ b/package-returns-traceability.docx
@@ -627,7 +627,7 @@
           <w:sz-cs w:val="28"/>
           <w:b/>
         </w:rPr>
-        <w:t xml:space="preserve">Storage: Supabase</w:t>
+        <w:t xml:space="preserve">Storage: a MySQL/MariaDB database (on Plesk)</w:t>
       </w:r>
       <w:r>
         <w:rPr>
@@ -1738,7 +1738,7 @@
           <w:sz w:val="28"/>
           <w:sz-cs w:val="28"/>
         </w:rPr>
-        <w:t xml:space="preserve"> Supabase Auth, with two roles — </w:t>
+        <w:t xml:space="preserve"> our own email/password auth with two roles — </w:t>
       </w:r>
       <w:r>
         <w:rPr>
@@ -1772,41 +1772,24 @@
           <w:sz w:val="28"/>
           <w:sz-cs w:val="28"/>
         </w:rPr>
-        <w:t xml:space="preserve"> (can process returns) — and </w:t>
-      </w:r>
-      <w:r>
-        <w:rPr>
-          <w:rFonts w:ascii="Arial" w:hAnsi="Arial" w:cs="Arial"/>
-          <w:sz w:val="28"/>
-          <w:sz-cs w:val="28"/>
-          <w:b/>
-        </w:rPr>
-        <w:t xml:space="preserve">Row Level Security</w:t>
-      </w:r>
-      <w:r>
-        <w:rPr>
-          <w:rFonts w:ascii="Arial" w:hAnsi="Arial" w:cs="Arial"/>
-          <w:sz w:val="28"/>
-          <w:sz-cs w:val="28"/>
-        </w:rPr>
-        <w:t xml:space="preserve"> so each customer's data is </w:t>
-      </w:r>
-      <w:r>
-        <w:rPr>
-          <w:rFonts w:ascii="Arial" w:hAnsi="Arial" w:cs="Arial"/>
-          <w:sz w:val="28"/>
-          <w:sz-cs w:val="28"/>
-          <w:b/>
-        </w:rPr>
-        <w:t xml:space="preserve">totally separated</w:t>
-      </w:r>
-      <w:r>
-        <w:rPr>
-          <w:rFonts w:ascii="Arial" w:hAnsi="Arial" w:cs="Arial"/>
-          <w:sz w:val="28"/>
-          <w:sz-cs w:val="28"/>
-        </w:rPr>
-        <w:t xml:space="preserve"> (a user only ever sees their customer's rows).</w:t>
+        <w:t xml:space="preserve"> (can process returns). Per-customer isolation is enforced in the </w:t>
+      </w:r>
+      <w:r>
+        <w:rPr>
+          <w:rFonts w:ascii="Arial" w:hAnsi="Arial" w:cs="Arial"/>
+          <w:sz w:val="28"/>
+          <w:sz-cs w:val="28"/>
+          <w:b/>
+        </w:rPr>
+        <w:t xml:space="preserve">API</w:t>
+      </w:r>
+      <w:r>
+        <w:rPr>
+          <w:rFonts w:ascii="Arial" w:hAnsi="Arial" w:cs="Arial"/>
+          <w:sz w:val="28"/>
+          <w:sz-cs w:val="28"/>
+        </w:rPr>
+        <w:t xml:space="preserve"> (every query scoped by `customer_id`); the database itself has no row-level security.</w:t>
       </w:r>
     </w:p>
     <w:p>
@@ -2058,7 +2041,7 @@
         </w:rPr>
         <w:t xml:space="preserve">•</w:t>
         <w:tab/>
-        <w:t xml:space="preserve">Connected MCP servers in Zed: Supabase (DB/migrations) and Playwright (browser, optional).</w:t>
+        <w:t xml:space="preserve">Stack: React + Vite web app, Node/Express API, MySQL/MariaDB on Plesk (no Supabase).</w:t>
       </w:r>
     </w:p>
     <w:sectPr>

</xml_diff>

<commit_message>
Update all documentation for Spanish UI and translations
Refresh the README, PRD, security review, Plesk deployment guide, design specs, and task logs. Document the Spanish default, ES/EN switch, editable Traducciones table, translation API permissions, migration 013, 272-test suite, and the one-command deploy script. Regenerate the intent Word document from its markdown source.
</commit_message>
<xml_diff>
--- a/package-returns-traceability.docx
+++ b/package-returns-traceability.docx
@@ -1697,7 +1697,7 @@
           <w:sz-cs w:val="28"/>
           <w:b/>
         </w:rPr>
-        <w:t xml:space="preserve">Cross-cutting</w:t>
+        <w:t xml:space="preserve">Current implementation (2026-10-19)</w:t>
       </w:r>
       <w:r>
         <w:rPr>
@@ -1721,75 +1721,54 @@
         </w:rPr>
         <w:t xml:space="preserve">•</w:t>
         <w:tab/>
-        <w:t xml:space="preserve"/>
-      </w:r>
-      <w:r>
-        <w:rPr>
-          <w:rFonts w:ascii="Arial" w:hAnsi="Arial" w:cs="Arial"/>
-          <w:sz w:val="28"/>
-          <w:sz-cs w:val="28"/>
-          <w:b/>
-        </w:rPr>
-        <w:t xml:space="preserve">Roles &amp; auth:</w:t>
-      </w:r>
-      <w:r>
-        <w:rPr>
-          <w:rFonts w:ascii="Arial" w:hAnsi="Arial" w:cs="Arial"/>
-          <w:sz w:val="28"/>
-          <w:sz-cs w:val="28"/>
-        </w:rPr>
-        <w:t xml:space="preserve"> our own email/password auth with two roles — </w:t>
-      </w:r>
-      <w:r>
-        <w:rPr>
-          <w:rFonts w:ascii="Arial" w:hAnsi="Arial" w:cs="Arial"/>
-          <w:sz w:val="28"/>
-          <w:sz-cs w:val="28"/>
-          <w:b/>
-        </w:rPr>
-        <w:t xml:space="preserve">Admin</w:t>
-      </w:r>
-      <w:r>
-        <w:rPr>
-          <w:rFonts w:ascii="Arial" w:hAnsi="Arial" w:cs="Arial"/>
-          <w:sz w:val="28"/>
-          <w:sz-cs w:val="28"/>
-        </w:rPr>
-        <w:t xml:space="preserve"> (can upload) and </w:t>
-      </w:r>
-      <w:r>
-        <w:rPr>
-          <w:rFonts w:ascii="Arial" w:hAnsi="Arial" w:cs="Arial"/>
-          <w:sz w:val="28"/>
-          <w:sz-cs w:val="28"/>
-          <w:b/>
-        </w:rPr>
-        <w:t xml:space="preserve">User</w:t>
-      </w:r>
-      <w:r>
-        <w:rPr>
-          <w:rFonts w:ascii="Arial" w:hAnsi="Arial" w:cs="Arial"/>
-          <w:sz w:val="28"/>
-          <w:sz-cs w:val="28"/>
-        </w:rPr>
-        <w:t xml:space="preserve"> (can process returns). Per-customer isolation is enforced in the </w:t>
-      </w:r>
-      <w:r>
-        <w:rPr>
-          <w:rFonts w:ascii="Arial" w:hAnsi="Arial" w:cs="Arial"/>
-          <w:sz w:val="28"/>
-          <w:sz-cs w:val="28"/>
-          <w:b/>
-        </w:rPr>
-        <w:t xml:space="preserve">API</w:t>
-      </w:r>
-      <w:r>
-        <w:rPr>
-          <w:rFonts w:ascii="Arial" w:hAnsi="Arial" w:cs="Arial"/>
-          <w:sz w:val="28"/>
-          <w:sz-cs w:val="28"/>
-        </w:rPr>
-        <w:t xml:space="preserve"> (every query scoped by `customer_id`); the database itself has no row-level security.</w:t>
+        <w:t xml:space="preserve">The app opens in </w:t>
+      </w:r>
+      <w:r>
+        <w:rPr>
+          <w:rFonts w:ascii="Arial" w:hAnsi="Arial" w:cs="Arial"/>
+          <w:sz w:val="28"/>
+          <w:sz-cs w:val="28"/>
+          <w:b/>
+        </w:rPr>
+        <w:t xml:space="preserve">Spanish</w:t>
+      </w:r>
+      <w:r>
+        <w:rPr>
+          <w:rFonts w:ascii="Arial" w:hAnsi="Arial" w:cs="Arial"/>
+          <w:sz w:val="28"/>
+          <w:sz-cs w:val="28"/>
+        </w:rPr>
+        <w:t xml:space="preserve"> for everyone; an </w:t>
+      </w:r>
+      <w:r>
+        <w:rPr>
+          <w:rFonts w:ascii="Arial" w:hAnsi="Arial" w:cs="Arial"/>
+          <w:sz w:val="28"/>
+          <w:sz-cs w:val="28"/>
+          <w:b/>
+        </w:rPr>
+        <w:t xml:space="preserve">ES / EN</w:t>
+      </w:r>
+      <w:r>
+        <w:rPr>
+          <w:rFonts w:ascii="Arial" w:hAnsi="Arial" w:cs="Arial"/>
+          <w:sz w:val="28"/>
+          <w:sz-cs w:val="28"/>
+        </w:rPr>
+        <w:t xml:space="preserve"> switch in the header keeps the original</w:t>
+      </w:r>
+    </w:p>
+    <w:p>
+      <w:pPr>
+        <w:spacing w:after="120"/>
+      </w:pPr>
+      <w:r>
+        <w:rPr>
+          <w:rFonts w:ascii="Arial" w:hAnsi="Arial" w:cs="Arial"/>
+          <w:sz w:val="28"/>
+          <w:sz-cs w:val="28"/>
+        </w:rPr>
+        <w:t xml:space="preserve">  English available for comparison.</w:t>
       </w:r>
     </w:p>
     <w:p>
@@ -1805,24 +1784,50 @@
         </w:rPr>
         <w:t xml:space="preserve">•</w:t>
         <w:tab/>
-        <w:t xml:space="preserve"/>
-      </w:r>
-      <w:r>
-        <w:rPr>
-          <w:rFonts w:ascii="Arial" w:hAnsi="Arial" w:cs="Arial"/>
-          <w:sz w:val="28"/>
-          <w:sz-cs w:val="28"/>
-          <w:b/>
-        </w:rPr>
-        <w:t xml:space="preserve">Constraints:</w:t>
-      </w:r>
-      <w:r>
-        <w:rPr>
-          <w:rFonts w:ascii="Arial" w:hAnsi="Arial" w:cs="Arial"/>
-          <w:sz w:val="28"/>
-          <w:sz-cs w:val="28"/>
-        </w:rPr>
-        <w:t xml:space="preserve"> none binding.</w:t>
+        <w:t xml:space="preserve">Administrators edit both languages in </w:t>
+      </w:r>
+      <w:r>
+        <w:rPr>
+          <w:rFonts w:ascii="Arial" w:hAnsi="Arial" w:cs="Arial"/>
+          <w:sz w:val="28"/>
+          <w:sz-cs w:val="28"/>
+          <w:b/>
+        </w:rPr>
+        <w:t xml:space="preserve">Traducciones</w:t>
+      </w:r>
+      <w:r>
+        <w:rPr>
+          <w:rFonts w:ascii="Arial" w:hAnsi="Arial" w:cs="Arial"/>
+          <w:sz w:val="28"/>
+          <w:sz-cs w:val="28"/>
+        </w:rPr>
+        <w:t xml:space="preserve"> (`/translations`), grouped by screen and role.</w:t>
+      </w:r>
+    </w:p>
+    <w:p>
+      <w:pPr>
+        <w:spacing w:after="120"/>
+      </w:pPr>
+      <w:r>
+        <w:rPr>
+          <w:rFonts w:ascii="Arial" w:hAnsi="Arial" w:cs="Arial"/>
+          <w:sz w:val="28"/>
+          <w:sz-cs w:val="28"/>
+        </w:rPr>
+        <w:t xml:space="preserve">  Operators cannot open the editor. The live copy is in MySQL `translations`, seeded from</w:t>
+      </w:r>
+    </w:p>
+    <w:p>
+      <w:pPr>
+        <w:spacing w:after="120"/>
+      </w:pPr>
+      <w:r>
+        <w:rPr>
+          <w:rFonts w:ascii="Arial" w:hAnsi="Arial" w:cs="Arial"/>
+          <w:sz w:val="28"/>
+          <w:sz-cs w:val="28"/>
+        </w:rPr>
+        <w:t xml:space="preserve">  `shared/translations.ts`.</w:t>
       </w:r>
     </w:p>
     <w:p>
@@ -1838,24 +1843,20 @@
         </w:rPr>
         <w:t xml:space="preserve">•</w:t>
         <w:tab/>
-        <w:t xml:space="preserve"/>
-      </w:r>
-      <w:r>
-        <w:rPr>
-          <w:rFonts w:ascii="Arial" w:hAnsi="Arial" w:cs="Arial"/>
-          <w:sz w:val="28"/>
-          <w:sz-cs w:val="28"/>
-          <w:b/>
-        </w:rPr>
-        <w:t xml:space="preserve">Success metric:</w:t>
-      </w:r>
-      <w:r>
-        <w:rPr>
-          <w:rFonts w:ascii="Arial" w:hAnsi="Arial" w:cs="Arial"/>
-          <w:sz w:val="28"/>
-          <w:sz-cs w:val="28"/>
-        </w:rPr>
-        <w:t xml:space="preserve"> not important.</w:t>
+        <w:t xml:space="preserve">Server API error messages remain in English in this phase; static UI copy, client-side validation and</w:t>
+      </w:r>
+    </w:p>
+    <w:p>
+      <w:pPr>
+        <w:spacing w:after="120"/>
+      </w:pPr>
+      <w:r>
+        <w:rPr>
+          <w:rFonts w:ascii="Arial" w:hAnsi="Arial" w:cs="Arial"/>
+          <w:sz w:val="28"/>
+          <w:sz-cs w:val="28"/>
+        </w:rPr>
+        <w:t xml:space="preserve">  download notices are translated.</w:t>
       </w:r>
     </w:p>
     <w:p>
@@ -1871,6 +1872,263 @@
         </w:rPr>
         <w:t xml:space="preserve">•</w:t>
         <w:tab/>
+        <w:t xml:space="preserve">The rest of the intent is unchanged.</w:t>
+      </w:r>
+    </w:p>
+    <w:p>
+      <w:pPr>
+        <w:spacing w:after="120"/>
+      </w:pPr>
+      <w:r>
+        <w:rPr>
+          <w:rFonts w:ascii="Arial" w:hAnsi="Arial" w:cs="Arial"/>
+          <w:sz w:val="28"/>
+          <w:sz-cs w:val="28"/>
+          <w:b/>
+        </w:rPr>
+        <w:t xml:space="preserve">Cross-cutting</w:t>
+      </w:r>
+      <w:r>
+        <w:rPr>
+          <w:rFonts w:ascii="Arial" w:hAnsi="Arial" w:cs="Arial"/>
+          <w:sz w:val="28"/>
+          <w:sz-cs w:val="28"/>
+        </w:rPr>
+        <w:t xml:space="preserve"/>
+      </w:r>
+    </w:p>
+    <w:p>
+      <w:pPr>
+        <w:ind w:left="720" w:first-line="-360"/>
+        <w:spacing w:after="120"/>
+      </w:pPr>
+      <w:r>
+        <w:rPr>
+          <w:rFonts w:ascii="Arial" w:hAnsi="Arial" w:cs="Arial"/>
+          <w:sz w:val="28"/>
+          <w:sz-cs w:val="28"/>
+        </w:rPr>
+        <w:t xml:space="preserve">•</w:t>
+        <w:tab/>
+        <w:t xml:space="preserve"/>
+      </w:r>
+      <w:r>
+        <w:rPr>
+          <w:rFonts w:ascii="Arial" w:hAnsi="Arial" w:cs="Arial"/>
+          <w:sz w:val="28"/>
+          <w:sz-cs w:val="28"/>
+          <w:b/>
+        </w:rPr>
+        <w:t xml:space="preserve">Roles &amp; auth:</w:t>
+      </w:r>
+      <w:r>
+        <w:rPr>
+          <w:rFonts w:ascii="Arial" w:hAnsi="Arial" w:cs="Arial"/>
+          <w:sz w:val="28"/>
+          <w:sz-cs w:val="28"/>
+        </w:rPr>
+        <w:t xml:space="preserve"> our own email/password auth with two roles — </w:t>
+      </w:r>
+      <w:r>
+        <w:rPr>
+          <w:rFonts w:ascii="Arial" w:hAnsi="Arial" w:cs="Arial"/>
+          <w:sz w:val="28"/>
+          <w:sz-cs w:val="28"/>
+          <w:b/>
+        </w:rPr>
+        <w:t xml:space="preserve">Admin</w:t>
+      </w:r>
+      <w:r>
+        <w:rPr>
+          <w:rFonts w:ascii="Arial" w:hAnsi="Arial" w:cs="Arial"/>
+          <w:sz w:val="28"/>
+          <w:sz-cs w:val="28"/>
+        </w:rPr>
+        <w:t xml:space="preserve"> (`superadmin`, can upload and</w:t>
+      </w:r>
+    </w:p>
+    <w:p>
+      <w:pPr>
+        <w:spacing w:after="120"/>
+      </w:pPr>
+      <w:r>
+        <w:rPr>
+          <w:rFonts w:ascii="Arial" w:hAnsi="Arial" w:cs="Arial"/>
+          <w:sz w:val="28"/>
+          <w:sz-cs w:val="28"/>
+        </w:rPr>
+        <w:t xml:space="preserve">  administer) and </w:t>
+      </w:r>
+      <w:r>
+        <w:rPr>
+          <w:rFonts w:ascii="Arial" w:hAnsi="Arial" w:cs="Arial"/>
+          <w:sz w:val="28"/>
+          <w:sz-cs w:val="28"/>
+          <w:b/>
+        </w:rPr>
+        <w:t xml:space="preserve">User</w:t>
+      </w:r>
+      <w:r>
+        <w:rPr>
+          <w:rFonts w:ascii="Arial" w:hAnsi="Arial" w:cs="Arial"/>
+          <w:sz w:val="28"/>
+          <w:sz-cs w:val="28"/>
+        </w:rPr>
+        <w:t xml:space="preserve"> (`user`, can process returns). The login screen's two doors choose the</w:t>
+      </w:r>
+    </w:p>
+    <w:p>
+      <w:pPr>
+        <w:spacing w:after="120"/>
+      </w:pPr>
+      <w:r>
+        <w:rPr>
+          <w:rFonts w:ascii="Arial" w:hAnsi="Arial" w:cs="Arial"/>
+          <w:sz w:val="28"/>
+          <w:sz-cs w:val="28"/>
+        </w:rPr>
+        <w:t xml:space="preserve">  administrator or operator </w:t>
+      </w:r>
+      <w:r>
+        <w:rPr>
+          <w:rFonts w:ascii="Arial" w:hAnsi="Arial" w:cs="Arial"/>
+          <w:sz w:val="28"/>
+          <w:sz-cs w:val="28"/>
+          <w:b/>
+        </w:rPr>
+        <w:t xml:space="preserve">view</w:t>
+      </w:r>
+      <w:r>
+        <w:rPr>
+          <w:rFonts w:ascii="Arial" w:hAnsi="Arial" w:cs="Arial"/>
+          <w:sz w:val="28"/>
+          <w:sz-cs w:val="28"/>
+        </w:rPr>
+        <w:t xml:space="preserve">; the door never changes the account role. Per-customer isolation</w:t>
+      </w:r>
+    </w:p>
+    <w:p>
+      <w:pPr>
+        <w:spacing w:after="120"/>
+      </w:pPr>
+      <w:r>
+        <w:rPr>
+          <w:rFonts w:ascii="Arial" w:hAnsi="Arial" w:cs="Arial"/>
+          <w:sz w:val="28"/>
+          <w:sz-cs w:val="28"/>
+        </w:rPr>
+        <w:t xml:space="preserve">  is enforced in the </w:t>
+      </w:r>
+      <w:r>
+        <w:rPr>
+          <w:rFonts w:ascii="Arial" w:hAnsi="Arial" w:cs="Arial"/>
+          <w:sz w:val="28"/>
+          <w:sz-cs w:val="28"/>
+          <w:b/>
+        </w:rPr>
+        <w:t xml:space="preserve">API</w:t>
+      </w:r>
+      <w:r>
+        <w:rPr>
+          <w:rFonts w:ascii="Arial" w:hAnsi="Arial" w:cs="Arial"/>
+          <w:sz w:val="28"/>
+          <w:sz-cs w:val="28"/>
+        </w:rPr>
+        <w:t xml:space="preserve"> (every query scoped by `customer_id`); the database itself has no</w:t>
+      </w:r>
+    </w:p>
+    <w:p>
+      <w:pPr>
+        <w:spacing w:after="120"/>
+      </w:pPr>
+      <w:r>
+        <w:rPr>
+          <w:rFonts w:ascii="Arial" w:hAnsi="Arial" w:cs="Arial"/>
+          <w:sz w:val="28"/>
+          <w:sz-cs w:val="28"/>
+        </w:rPr>
+        <w:t xml:space="preserve">  row-level security. Translation writes are administrator-only.</w:t>
+      </w:r>
+    </w:p>
+    <w:p>
+      <w:pPr>
+        <w:ind w:left="720" w:first-line="-360"/>
+        <w:spacing w:after="120"/>
+      </w:pPr>
+      <w:r>
+        <w:rPr>
+          <w:rFonts w:ascii="Arial" w:hAnsi="Arial" w:cs="Arial"/>
+          <w:sz w:val="28"/>
+          <w:sz-cs w:val="28"/>
+        </w:rPr>
+        <w:t xml:space="preserve">•</w:t>
+        <w:tab/>
+        <w:t xml:space="preserve"/>
+      </w:r>
+      <w:r>
+        <w:rPr>
+          <w:rFonts w:ascii="Arial" w:hAnsi="Arial" w:cs="Arial"/>
+          <w:sz w:val="28"/>
+          <w:sz-cs w:val="28"/>
+          <w:b/>
+        </w:rPr>
+        <w:t xml:space="preserve">Constraints:</w:t>
+      </w:r>
+      <w:r>
+        <w:rPr>
+          <w:rFonts w:ascii="Arial" w:hAnsi="Arial" w:cs="Arial"/>
+          <w:sz w:val="28"/>
+          <w:sz-cs w:val="28"/>
+        </w:rPr>
+        <w:t xml:space="preserve"> none binding.</w:t>
+      </w:r>
+    </w:p>
+    <w:p>
+      <w:pPr>
+        <w:ind w:left="720" w:first-line="-360"/>
+        <w:spacing w:after="120"/>
+      </w:pPr>
+      <w:r>
+        <w:rPr>
+          <w:rFonts w:ascii="Arial" w:hAnsi="Arial" w:cs="Arial"/>
+          <w:sz w:val="28"/>
+          <w:sz-cs w:val="28"/>
+        </w:rPr>
+        <w:t xml:space="preserve">•</w:t>
+        <w:tab/>
+        <w:t xml:space="preserve"/>
+      </w:r>
+      <w:r>
+        <w:rPr>
+          <w:rFonts w:ascii="Arial" w:hAnsi="Arial" w:cs="Arial"/>
+          <w:sz w:val="28"/>
+          <w:sz-cs w:val="28"/>
+          <w:b/>
+        </w:rPr>
+        <w:t xml:space="preserve">Success metric:</w:t>
+      </w:r>
+      <w:r>
+        <w:rPr>
+          <w:rFonts w:ascii="Arial" w:hAnsi="Arial" w:cs="Arial"/>
+          <w:sz w:val="28"/>
+          <w:sz-cs w:val="28"/>
+        </w:rPr>
+        <w:t xml:space="preserve"> not important.</w:t>
+      </w:r>
+    </w:p>
+    <w:p>
+      <w:pPr>
+        <w:ind w:left="720" w:first-line="-360"/>
+        <w:spacing w:after="120"/>
+      </w:pPr>
+      <w:r>
+        <w:rPr>
+          <w:rFonts w:ascii="Arial" w:hAnsi="Arial" w:cs="Arial"/>
+          <w:sz w:val="28"/>
+          <w:sz-cs w:val="28"/>
+        </w:rPr>
+        <w:t xml:space="preserve">•</w:t>
+        <w:tab/>
         <w:t xml:space="preserve"/>
       </w:r>
       <w:r>
@@ -1987,7 +2245,7 @@
           <w:sz w:val="28"/>
           <w:sz-cs w:val="28"/>
         </w:rPr>
-        <w:t xml:space="preserve">Customer (1 master DB each) → Campaigns (many per customer) → campaign lists (multiple uploads) → store rows / packages → returns (reason; "closed" scoped per campaign) → resends (linked sender IDs, one Package Chain ID) → flagged export.</w:t>
+        <w:t xml:space="preserve">Customer (1 master DB each) → Campaigns (many per customer) → campaign lists (multiple uploads) → store rows / packages → returns (reason; "closed" scoped per campaign) → resends (linked sender IDs, one Package Chain ID) → flagged export. A platform-wide `translations` table (screen, role, English, Spanish) holds the UI copy.</w:t>
       </w:r>
     </w:p>
     <w:p>

</xml_diff>